<commit_message>
Fix Ground Rules table overflowing right margin
Table width was computed from page width minus a single margin,
pushing it past the right page margin. Size it to the actual content
width (page width minus both margins) instead.
</commit_message>
<xml_diff>
--- a/docs/Team2_Ground_Rules.docx
+++ b/docs/Team2_Ground_Rules.docx
@@ -191,7 +191,7 @@
     </w:p>
     <w:tbl>
       <w:tblPr>
-        <w:tblW w:type="dxa" w:w="10800"/>
+        <w:tblW w:type="dxa" w:w="9360"/>
         <w:tblBorders>
           <w:top w:val="single" w:color="auto" w:sz="4"/>
           <w:left w:val="single" w:color="auto" w:sz="4"/>
@@ -202,15 +202,15 @@
         </w:tblBorders>
       </w:tblPr>
       <w:tblGrid>
-        <w:gridCol w:w="2700"/>
-        <w:gridCol w:w="2700"/>
-        <w:gridCol w:w="2700"/>
-        <w:gridCol w:w="2700"/>
+        <w:gridCol w:w="2340"/>
+        <w:gridCol w:w="2340"/>
+        <w:gridCol w:w="2340"/>
+        <w:gridCol w:w="2340"/>
       </w:tblGrid>
       <w:tr>
         <w:tc>
           <w:tcPr>
-            <w:tcW w:type="dxa" w:w="2700"/>
+            <w:tcW w:type="dxa" w:w="2340"/>
             <w:tcBorders>
               <w:top w:val="single" w:color="000000" w:sz="4"/>
               <w:left w:val="single" w:color="000000" w:sz="4"/>
@@ -233,7 +233,7 @@
         </w:tc>
         <w:tc>
           <w:tcPr>
-            <w:tcW w:type="dxa" w:w="2700"/>
+            <w:tcW w:type="dxa" w:w="2340"/>
             <w:tcBorders>
               <w:top w:val="single" w:color="000000" w:sz="4"/>
               <w:left w:val="single" w:color="000000" w:sz="4"/>
@@ -256,7 +256,7 @@
         </w:tc>
         <w:tc>
           <w:tcPr>
-            <w:tcW w:type="dxa" w:w="2700"/>
+            <w:tcW w:type="dxa" w:w="2340"/>
             <w:tcBorders>
               <w:top w:val="single" w:color="000000" w:sz="4"/>
               <w:left w:val="single" w:color="000000" w:sz="4"/>
@@ -279,7 +279,7 @@
         </w:tc>
         <w:tc>
           <w:tcPr>
-            <w:tcW w:type="dxa" w:w="2700"/>
+            <w:tcW w:type="dxa" w:w="2340"/>
             <w:tcBorders>
               <w:top w:val="single" w:color="000000" w:sz="4"/>
               <w:left w:val="single" w:color="000000" w:sz="4"/>
@@ -304,7 +304,7 @@
       <w:tr>
         <w:tc>
           <w:tcPr>
-            <w:tcW w:type="dxa" w:w="2700"/>
+            <w:tcW w:type="dxa" w:w="2340"/>
             <w:tcBorders>
               <w:top w:val="single" w:color="000000" w:sz="4"/>
               <w:left w:val="single" w:color="000000" w:sz="4"/>
@@ -317,7 +317,7 @@
         </w:tc>
         <w:tc>
           <w:tcPr>
-            <w:tcW w:type="dxa" w:w="2700"/>
+            <w:tcW w:type="dxa" w:w="2340"/>
             <w:tcBorders>
               <w:top w:val="single" w:color="000000" w:sz="4"/>
               <w:left w:val="single" w:color="000000" w:sz="4"/>
@@ -330,7 +330,7 @@
         </w:tc>
         <w:tc>
           <w:tcPr>
-            <w:tcW w:type="dxa" w:w="2700"/>
+            <w:tcW w:type="dxa" w:w="2340"/>
             <w:tcBorders>
               <w:top w:val="single" w:color="000000" w:sz="4"/>
               <w:left w:val="single" w:color="000000" w:sz="4"/>
@@ -343,7 +343,7 @@
         </w:tc>
         <w:tc>
           <w:tcPr>
-            <w:tcW w:type="dxa" w:w="2700"/>
+            <w:tcW w:type="dxa" w:w="2340"/>
             <w:tcBorders>
               <w:top w:val="single" w:color="000000" w:sz="4"/>
               <w:left w:val="single" w:color="000000" w:sz="4"/>

</xml_diff>

<commit_message>
Translate all repo content to English
All docs and README are read by international teammates and HP, so
translate the remaining Korean content: project_proposal_draft.md,
team_rnr.md, step_library_comparison.md, architecture.md, plus the
README's team table. Regenerate Team2_Ground_Rules.docx (leader name
in English), Weekly_Report_Template.docx (English placeholders), and
Team_RnR.pdf (English, matching the updated team_rnr.md) accordingly.
</commit_message>
<xml_diff>
--- a/docs/Team2_Ground_Rules.docx
+++ b/docs/Team2_Ground_Rules.docx
@@ -42,7 +42,7 @@
           <w:sz w:val="22"/>
           <w:szCs w:val="22"/>
         </w:rPr>
-        <w:t xml:space="preserve">Team Leader: 이준오 (202010128)</w:t>
+        <w:t xml:space="preserve">Team Leader: Junoh Lee</w:t>
       </w:r>
     </w:p>
     <w:p>
@@ -227,7 +227,7 @@
                 <w:b/>
                 <w:bCs/>
               </w:rPr>
-              <w:t xml:space="preserve">이준오 (Team Leader)</w:t>
+              <w:t xml:space="preserve">Junoh Lee (Team Leader)</w:t>
             </w:r>
           </w:p>
         </w:tc>

</xml_diff>

<commit_message>
Write team member names in the same order in the ground rules
Hemanth Reddy Vangala and Aneela Tahir, as in all other documents.
</commit_message>
<xml_diff>
--- a/docs/Team2_Ground_Rules.docx
+++ b/docs/Team2_Ground_Rules.docx
@@ -250,7 +250,7 @@
                 <w:b/>
                 <w:bCs/>
               </w:rPr>
-              <w:t xml:space="preserve">Vangala Hemanth Reddy</w:t>
+              <w:t xml:space="preserve">Hemanth Reddy Vangala</w:t>
             </w:r>
           </w:p>
         </w:tc>
@@ -273,7 +273,7 @@
                 <w:b/>
                 <w:bCs/>
               </w:rPr>
-              <w:t xml:space="preserve">Tahir Aneela</w:t>
+              <w:t xml:space="preserve">Aneela Tahir</w:t>
             </w:r>
           </w:p>
         </w:tc>

</xml_diff>